<commit_message>
Updated to 1.3.5 with better analytic support
Added support fo0o testrunviewer and other stuff
</commit_message>
<xml_diff>
--- a/docs/TapRunner_Tutorial.docx
+++ b/docs/TapRunner_Tutorial.docx
@@ -16,7 +16,7 @@
           <w:color w:val="404040"/>
           <w:sz w:val="26"/>
         </w:rPr>
-        <w:t>Running a test station with TapRunner 1.3.3, using PowerON.TapPlan as the worked example</w:t>
+        <w:t>Running a test station with TapRunner 1.3.5, using PowerON.TapPlan as the worked example</w:t>
       </w:r>
     </w:p>
     <w:p>
@@ -26,7 +26,7 @@
     </w:p>
     <w:p>
       <w:r>
-        <w:t xml:space="preserve">This tutorial walks an operator through a complete test with TapRunner: loading a test plan, checking its parameters, running it, reading the result, and finding out why a run failed. Every screen shown was captured from TapRunner 1.3.3 with </w:t>
+        <w:t xml:space="preserve">This tutorial walks an operator through a complete test with TapRunner: loading a test plan, checking its parameters, running it, reading the result, and finding out why a run failed. Every screen shown was captured from TapRunner 1.3.5 with </w:t>
       </w:r>
       <w:r>
         <w:rPr>
@@ -72,7 +72,7 @@
       <w:r>
         <w:fldChar w:fldCharType="separate"/>
       </w:r>
-      <w:hyperlink w:anchor="_Toc242691808" w:history="1">
+      <w:hyperlink w:anchor="_Toc244079241" w:history="1">
         <w:r>
           <w:rPr>
             <w:rStyle w:val="Hyperlink"/>
@@ -99,7 +99,7 @@
             <w:noProof/>
             <w:webHidden/>
           </w:rPr>
-          <w:instrText xml:space="preserve"> PAGEREF _Toc242691808 \h </w:instrText>
+          <w:instrText xml:space="preserve"> PAGEREF _Toc244079241 \h </w:instrText>
         </w:r>
         <w:r>
           <w:rPr>
@@ -145,7 +145,7 @@
           <w14:ligatures w14:val="standardContextual"/>
         </w:rPr>
       </w:pPr>
-      <w:hyperlink w:anchor="_Toc242691809" w:history="1">
+      <w:hyperlink w:anchor="_Toc244079242" w:history="1">
         <w:r>
           <w:rPr>
             <w:rStyle w:val="Hyperlink"/>
@@ -172,7 +172,7 @@
             <w:noProof/>
             <w:webHidden/>
           </w:rPr>
-          <w:instrText xml:space="preserve"> PAGEREF _Toc242691809 \h </w:instrText>
+          <w:instrText xml:space="preserve"> PAGEREF _Toc244079242 \h </w:instrText>
         </w:r>
         <w:r>
           <w:rPr>
@@ -218,7 +218,7 @@
           <w14:ligatures w14:val="standardContextual"/>
         </w:rPr>
       </w:pPr>
-      <w:hyperlink w:anchor="_Toc242691810" w:history="1">
+      <w:hyperlink w:anchor="_Toc244079243" w:history="1">
         <w:r>
           <w:rPr>
             <w:rStyle w:val="Hyperlink"/>
@@ -245,7 +245,7 @@
             <w:noProof/>
             <w:webHidden/>
           </w:rPr>
-          <w:instrText xml:space="preserve"> PAGEREF _Toc242691810 \h </w:instrText>
+          <w:instrText xml:space="preserve"> PAGEREF _Toc244079243 \h </w:instrText>
         </w:r>
         <w:r>
           <w:rPr>
@@ -291,7 +291,7 @@
           <w14:ligatures w14:val="standardContextual"/>
         </w:rPr>
       </w:pPr>
-      <w:hyperlink w:anchor="_Toc242691811" w:history="1">
+      <w:hyperlink w:anchor="_Toc244079244" w:history="1">
         <w:r>
           <w:rPr>
             <w:rStyle w:val="Hyperlink"/>
@@ -318,7 +318,7 @@
             <w:noProof/>
             <w:webHidden/>
           </w:rPr>
-          <w:instrText xml:space="preserve"> PAGEREF _Toc242691811 \h </w:instrText>
+          <w:instrText xml:space="preserve"> PAGEREF _Toc244079244 \h </w:instrText>
         </w:r>
         <w:r>
           <w:rPr>
@@ -364,7 +364,7 @@
           <w14:ligatures w14:val="standardContextual"/>
         </w:rPr>
       </w:pPr>
-      <w:hyperlink w:anchor="_Toc242691812" w:history="1">
+      <w:hyperlink w:anchor="_Toc244079245" w:history="1">
         <w:r>
           <w:rPr>
             <w:rStyle w:val="Hyperlink"/>
@@ -391,7 +391,7 @@
             <w:noProof/>
             <w:webHidden/>
           </w:rPr>
-          <w:instrText xml:space="preserve"> PAGEREF _Toc242691812 \h </w:instrText>
+          <w:instrText xml:space="preserve"> PAGEREF _Toc244079245 \h </w:instrText>
         </w:r>
         <w:r>
           <w:rPr>
@@ -437,7 +437,7 @@
           <w14:ligatures w14:val="standardContextual"/>
         </w:rPr>
       </w:pPr>
-      <w:hyperlink w:anchor="_Toc242691813" w:history="1">
+      <w:hyperlink w:anchor="_Toc244079246" w:history="1">
         <w:r>
           <w:rPr>
             <w:rStyle w:val="Hyperlink"/>
@@ -464,7 +464,7 @@
             <w:noProof/>
             <w:webHidden/>
           </w:rPr>
-          <w:instrText xml:space="preserve"> PAGEREF _Toc242691813 \h </w:instrText>
+          <w:instrText xml:space="preserve"> PAGEREF _Toc244079246 \h </w:instrText>
         </w:r>
         <w:r>
           <w:rPr>
@@ -510,7 +510,7 @@
           <w14:ligatures w14:val="standardContextual"/>
         </w:rPr>
       </w:pPr>
-      <w:hyperlink w:anchor="_Toc242691814" w:history="1">
+      <w:hyperlink w:anchor="_Toc244079247" w:history="1">
         <w:r>
           <w:rPr>
             <w:rStyle w:val="Hyperlink"/>
@@ -537,7 +537,7 @@
             <w:noProof/>
             <w:webHidden/>
           </w:rPr>
-          <w:instrText xml:space="preserve"> PAGEREF _Toc242691814 \h </w:instrText>
+          <w:instrText xml:space="preserve"> PAGEREF _Toc244079247 \h </w:instrText>
         </w:r>
         <w:r>
           <w:rPr>
@@ -583,13 +583,13 @@
           <w14:ligatures w14:val="standardContextual"/>
         </w:rPr>
       </w:pPr>
-      <w:hyperlink w:anchor="_Toc242691815" w:history="1">
+      <w:hyperlink w:anchor="_Toc244079248" w:history="1">
         <w:r>
           <w:rPr>
             <w:rStyle w:val="Hyperlink"/>
             <w:noProof/>
           </w:rPr>
-          <w:t>8. Logs</w:t>
+          <w:t>8. Logs and stored results</w:t>
         </w:r>
         <w:r>
           <w:rPr>
@@ -610,7 +610,7 @@
             <w:noProof/>
             <w:webHidden/>
           </w:rPr>
-          <w:instrText xml:space="preserve"> PAGEREF _Toc242691815 \h </w:instrText>
+          <w:instrText xml:space="preserve"> PAGEREF _Toc244079248 \h </w:instrText>
         </w:r>
         <w:r>
           <w:rPr>
@@ -656,7 +656,7 @@
           <w14:ligatures w14:val="standardContextual"/>
         </w:rPr>
       </w:pPr>
-      <w:hyperlink w:anchor="_Toc242691816" w:history="1">
+      <w:hyperlink w:anchor="_Toc244079249" w:history="1">
         <w:r>
           <w:rPr>
             <w:rStyle w:val="Hyperlink"/>
@@ -683,7 +683,7 @@
             <w:noProof/>
             <w:webHidden/>
           </w:rPr>
-          <w:instrText xml:space="preserve"> PAGEREF _Toc242691816 \h </w:instrText>
+          <w:instrText xml:space="preserve"> PAGEREF _Toc244079249 \h </w:instrText>
         </w:r>
         <w:r>
           <w:rPr>
@@ -728,8 +728,9 @@
       <w:pPr>
         <w:pStyle w:val="Heading1"/>
       </w:pPr>
-      <w:bookmarkStart w:id="0" w:name="_Toc242691808"/>
-      <w:r>
+      <w:bookmarkStart w:id="0" w:name="_Toc244079241"/>
+      <w:r>
+        <w:lastRenderedPageBreak/>
         <w:t>1. What TapRunner does</w:t>
       </w:r>
       <w:bookmarkEnd w:id="0"/>
@@ -760,7 +761,7 @@
         <w:pStyle w:val="ListBullet"/>
       </w:pPr>
       <w:r>
-        <w:t>a live list of every step as it finishes, and a separate list of only the steps that failed.</w:t>
+        <w:t>a live list of every step as it finishes, and a separate list of only the steps that failed, with their limits.</w:t>
       </w:r>
     </w:p>
     <w:p>
@@ -772,7 +773,7 @@
       <w:pPr>
         <w:pStyle w:val="Heading1"/>
       </w:pPr>
-      <w:bookmarkStart w:id="1" w:name="_Toc242691809"/>
+      <w:bookmarkStart w:id="1" w:name="_Toc244079242"/>
       <w:r>
         <w:t>2. Before you start (one-time setup)</w:t>
       </w:r>
@@ -791,7 +792,7 @@
         <w:pStyle w:val="ListNumber"/>
         <w:numPr>
           <w:ilvl w:val="0"/>
-          <w:numId w:val="1"/>
+          <w:numId w:val="10"/>
         </w:numPr>
       </w:pPr>
       <w:r>
@@ -830,6 +831,23 @@
       </w:pPr>
       <w:r>
         <w:t>Start TapRunner from the Start menu.</w:t>
+      </w:r>
+    </w:p>
+    <w:p>
+      <w:pPr>
+        <w:pStyle w:val="ListNumber"/>
+      </w:pPr>
+      <w:r>
+        <w:t xml:space="preserve">To check that OpenTAP has the right plugin, open </w:t>
+      </w:r>
+      <w:r>
+        <w:rPr>
+          <w:b/>
+        </w:rPr>
+        <w:t>C:\OpenTAP\Packages\TapRunner.StatusListener\package.xml</w:t>
+      </w:r>
+      <w:r>
+        <w:t xml:space="preserve"> in Notepad: its Version should match TapRunner's (1.3.5 or later). If it is older, see section 9.</w:t>
       </w:r>
     </w:p>
     <w:p>
@@ -1074,7 +1092,7 @@
               <w:rPr>
                 <w:b w:val="0"/>
               </w:rPr>
-              <w:t>Working directory</w:t>
+              <w:t>Test results viewer</w:t>
             </w:r>
           </w:p>
         </w:tc>
@@ -1089,6 +1107,55 @@
               <w:cnfStyle w:val="000000010000" w:firstRow="0" w:lastRow="0" w:firstColumn="0" w:lastColumn="0" w:oddVBand="0" w:evenVBand="0" w:oddHBand="0" w:evenHBand="1" w:firstRowFirstColumn="0" w:firstRowLastColumn="0" w:lastRowFirstColumn="0" w:lastRowLastColumn="0"/>
             </w:pPr>
             <w:r>
+              <w:t xml:space="preserve">The program the </w:t>
+            </w:r>
+            <w:r>
+              <w:rPr>
+                <w:b/>
+              </w:rPr>
+              <w:t>View Results</w:t>
+            </w:r>
+            <w:r>
+              <w:t xml:space="preserve"> button opens that database in, normally C:\OpenTAP\TestRunViewer\TestRunViewerSqlite.exe.</w:t>
+            </w:r>
+          </w:p>
+        </w:tc>
+      </w:tr>
+      <w:tr>
+        <w:trPr>
+          <w:cnfStyle w:val="000000100000" w:firstRow="0" w:lastRow="0" w:firstColumn="0" w:lastColumn="0" w:oddVBand="0" w:evenVBand="0" w:oddHBand="1" w:evenHBand="0" w:firstRowFirstColumn="0" w:firstRowLastColumn="0" w:lastRowFirstColumn="0" w:lastRowLastColumn="0"/>
+          <w:cantSplit/>
+          <w:jc w:val="center"/>
+        </w:trPr>
+        <w:tc>
+          <w:tcPr>
+            <w:cnfStyle w:val="001000000000" w:firstRow="0" w:lastRow="0" w:firstColumn="1" w:lastColumn="0" w:oddVBand="0" w:evenVBand="0" w:oddHBand="0" w:evenHBand="0" w:firstRowFirstColumn="0" w:firstRowLastColumn="0" w:lastRowFirstColumn="0" w:lastRowLastColumn="0"/>
+            <w:tcW w:w="2592" w:type="dxa"/>
+          </w:tcPr>
+          <w:p>
+            <w:pPr>
+              <w:keepNext/>
+              <w:spacing w:after="40"/>
+            </w:pPr>
+            <w:r>
+              <w:rPr>
+                <w:b w:val="0"/>
+              </w:rPr>
+              <w:t>Working directory</w:t>
+            </w:r>
+          </w:p>
+        </w:tc>
+        <w:tc>
+          <w:tcPr>
+            <w:tcW w:w="6768" w:type="dxa"/>
+          </w:tcPr>
+          <w:p>
+            <w:pPr>
+              <w:keepNext/>
+              <w:spacing w:after="40"/>
+              <w:cnfStyle w:val="000000100000" w:firstRow="0" w:lastRow="0" w:firstColumn="0" w:lastColumn="0" w:oddVBand="0" w:evenVBand="0" w:oddHBand="1" w:evenHBand="0" w:firstRowFirstColumn="0" w:firstRowLastColumn="0" w:lastRowFirstColumn="0" w:lastRowLastColumn="0"/>
+            </w:pPr>
+            <w:r>
               <w:t>The folder tap.exe runs in, normally C:\OpenTAP.</w:t>
             </w:r>
           </w:p>
@@ -1096,7 +1163,7 @@
       </w:tr>
       <w:tr>
         <w:trPr>
-          <w:cnfStyle w:val="000000100000" w:firstRow="0" w:lastRow="0" w:firstColumn="0" w:lastColumn="0" w:oddVBand="0" w:evenVBand="0" w:oddHBand="1" w:evenHBand="0" w:firstRowFirstColumn="0" w:firstRowLastColumn="0" w:lastRowFirstColumn="0" w:lastRowLastColumn="0"/>
+          <w:cnfStyle w:val="000000010000" w:firstRow="0" w:lastRow="0" w:firstColumn="0" w:lastColumn="0" w:oddVBand="0" w:evenVBand="0" w:oddHBand="0" w:evenHBand="1" w:firstRowFirstColumn="0" w:firstRowLastColumn="0" w:lastRowFirstColumn="0" w:lastRowLastColumn="0"/>
           <w:cantSplit/>
           <w:jc w:val="center"/>
         </w:trPr>
@@ -1126,7 +1193,7 @@
             <w:pPr>
               <w:keepNext/>
               <w:spacing w:after="40"/>
-              <w:cnfStyle w:val="000000100000" w:firstRow="0" w:lastRow="0" w:firstColumn="0" w:lastColumn="0" w:oddVBand="0" w:evenVBand="0" w:oddHBand="1" w:evenHBand="0" w:firstRowFirstColumn="0" w:firstRowLastColumn="0" w:lastRowFirstColumn="0" w:lastRowLastColumn="0"/>
+              <w:cnfStyle w:val="000000010000" w:firstRow="0" w:lastRow="0" w:firstColumn="0" w:lastColumn="0" w:oddVBand="0" w:evenVBand="0" w:oddHBand="0" w:evenHBand="1" w:firstRowFirstColumn="0" w:firstRowLastColumn="0" w:lastRowFirstColumn="0" w:lastRowLastColumn="0"/>
             </w:pPr>
             <w:r>
               <w:t>The plans run by the Power On and Power Off buttons. PowerON.TapPlan and PowerOFF.TapPlan by default.</w:t>
@@ -1136,7 +1203,7 @@
       </w:tr>
       <w:tr>
         <w:trPr>
-          <w:cnfStyle w:val="000000010000" w:firstRow="0" w:lastRow="0" w:firstColumn="0" w:lastColumn="0" w:oddVBand="0" w:evenVBand="0" w:oddHBand="0" w:evenHBand="1" w:firstRowFirstColumn="0" w:firstRowLastColumn="0" w:lastRowFirstColumn="0" w:lastRowLastColumn="0"/>
+          <w:cnfStyle w:val="000000100000" w:firstRow="0" w:lastRow="0" w:firstColumn="0" w:lastColumn="0" w:oddVBand="0" w:evenVBand="0" w:oddHBand="1" w:evenHBand="0" w:firstRowFirstColumn="0" w:firstRowLastColumn="0" w:lastRowFirstColumn="0" w:lastRowLastColumn="0"/>
           <w:cantSplit/>
           <w:jc w:val="center"/>
         </w:trPr>
@@ -1164,7 +1231,7 @@
           <w:p>
             <w:pPr>
               <w:spacing w:after="40"/>
-              <w:cnfStyle w:val="000000010000" w:firstRow="0" w:lastRow="0" w:firstColumn="0" w:lastColumn="0" w:oddVBand="0" w:evenVBand="0" w:oddHBand="0" w:evenHBand="1" w:firstRowFirstColumn="0" w:firstRowLastColumn="0" w:lastRowFirstColumn="0" w:lastRowLastColumn="0"/>
+              <w:cnfStyle w:val="000000100000" w:firstRow="0" w:lastRow="0" w:firstColumn="0" w:lastColumn="0" w:oddVBand="0" w:evenVBand="0" w:oddHBand="1" w:evenHBand="0" w:firstRowFirstColumn="0" w:firstRowLastColumn="0" w:lastRowFirstColumn="0" w:lastRowLastColumn="0"/>
             </w:pPr>
             <w:r>
               <w:t>The name shown next to the operator. Defaults to the PC's name.</w:t>
@@ -1184,16 +1251,10 @@
           <w:noProof/>
         </w:rPr>
         <w:drawing>
-          <wp:inline distT="0" distB="0" distL="0" distR="0" wp14:anchorId="5BF57DBC" wp14:editId="73E58E27">
-            <wp:extent cx="3840480" cy="4279579"/>
+          <wp:inline distT="0" distB="0" distL="0" distR="0" wp14:anchorId="4CA0FCFD" wp14:editId="5716470E">
+            <wp:extent cx="3840480" cy="4274758"/>
             <wp:effectExtent l="0" t="0" r="0" b="0"/>
-            <wp:docPr id="1" name="Picture 1">
-              <a:extLst xmlns:a="http://schemas.openxmlformats.org/drawingml/2006/main">
-                <a:ext uri="{FF2B5EF4-FFF2-40B4-BE49-F238E27FC236}">
-                  <a16:creationId xmlns:a16="http://schemas.microsoft.com/office/drawing/2014/main" id="{F4639CAC-2AE4-4FEE-89F7-AFB7CFCCE66F}"/>
-                </a:ext>
-              </a:extLst>
-            </wp:docPr>
+            <wp:docPr id="1" name="Picture 1"/>
             <wp:cNvGraphicFramePr>
               <a:graphicFrameLocks xmlns:a="http://schemas.openxmlformats.org/drawingml/2006/main" noChangeAspect="1"/>
             </wp:cNvGraphicFramePr>
@@ -1205,7 +1266,7 @@
                     <pic:cNvPicPr/>
                   </pic:nvPicPr>
                   <pic:blipFill>
-                    <a:blip r:embed="rId7"/>
+                    <a:blip r:embed="rId8"/>
                     <a:stretch>
                       <a:fillRect/>
                     </a:stretch>
@@ -1213,7 +1274,7 @@
                   <pic:spPr>
                     <a:xfrm>
                       <a:off x="0" y="0"/>
-                      <a:ext cx="3840480" cy="4279579"/>
+                      <a:ext cx="3840480" cy="4274758"/>
                     </a:xfrm>
                     <a:prstGeom prst="rect">
                       <a:avLst/>
@@ -1234,14 +1295,24 @@
       <w:r>
         <w:t xml:space="preserve">Figure </w:t>
       </w:r>
-      <w:fldSimple w:instr=" SEQ Figure \* ARABIC ">
-        <w:r>
-          <w:rPr>
-            <w:noProof/>
-          </w:rPr>
-          <w:t>1</w:t>
-        </w:r>
-      </w:fldSimple>
+      <w:r>
+        <w:fldChar w:fldCharType="begin"/>
+      </w:r>
+      <w:r>
+        <w:instrText xml:space="preserve"> SEQ Figure \* ARABIC </w:instrText>
+      </w:r>
+      <w:r>
+        <w:fldChar w:fldCharType="separate"/>
+      </w:r>
+      <w:r>
+        <w:rPr>
+          <w:noProof/>
+        </w:rPr>
+        <w:t>1</w:t>
+      </w:r>
+      <w:r>
+        <w:fldChar w:fldCharType="end"/>
+      </w:r>
       <w:r>
         <w:t xml:space="preserve"> – Settings, General tab</w:t>
       </w:r>
@@ -1255,7 +1326,7 @@
       <w:pPr>
         <w:pStyle w:val="Heading1"/>
       </w:pPr>
-      <w:bookmarkStart w:id="2" w:name="_Toc242691810"/>
+      <w:bookmarkStart w:id="2" w:name="_Toc244079243"/>
       <w:r>
         <w:t>3. A tour of the main window</w:t>
       </w:r>
@@ -1276,16 +1347,10 @@
           <w:noProof/>
         </w:rPr>
         <w:drawing>
-          <wp:inline distT="0" distB="0" distL="0" distR="0" wp14:anchorId="488B6DD8" wp14:editId="2801E517">
-            <wp:extent cx="5760720" cy="4970467"/>
+          <wp:inline distT="0" distB="0" distL="0" distR="0" wp14:anchorId="0CB0D96D" wp14:editId="7791EF4E">
+            <wp:extent cx="5760720" cy="4964715"/>
             <wp:effectExtent l="0" t="0" r="0" b="0"/>
-            <wp:docPr id="2" name="Picture 2">
-              <a:extLst xmlns:a="http://schemas.openxmlformats.org/drawingml/2006/main">
-                <a:ext uri="{FF2B5EF4-FFF2-40B4-BE49-F238E27FC236}">
-                  <a16:creationId xmlns:a16="http://schemas.microsoft.com/office/drawing/2014/main" id="{EAEECB47-AE39-4372-8615-2C67CE94F05D}"/>
-                </a:ext>
-              </a:extLst>
-            </wp:docPr>
+            <wp:docPr id="2" name="Picture 2"/>
             <wp:cNvGraphicFramePr>
               <a:graphicFrameLocks xmlns:a="http://schemas.openxmlformats.org/drawingml/2006/main" noChangeAspect="1"/>
             </wp:cNvGraphicFramePr>
@@ -1297,7 +1362,7 @@
                     <pic:cNvPicPr/>
                   </pic:nvPicPr>
                   <pic:blipFill>
-                    <a:blip r:embed="rId8"/>
+                    <a:blip r:embed="rId9"/>
                     <a:stretch>
                       <a:fillRect/>
                     </a:stretch>
@@ -1305,7 +1370,7 @@
                   <pic:spPr>
                     <a:xfrm>
                       <a:off x="0" y="0"/>
-                      <a:ext cx="5760720" cy="4970467"/>
+                      <a:ext cx="5760720" cy="4964715"/>
                     </a:xfrm>
                     <a:prstGeom prst="rect">
                       <a:avLst/>
@@ -1326,14 +1391,24 @@
       <w:r>
         <w:t xml:space="preserve">Figure </w:t>
       </w:r>
-      <w:fldSimple w:instr=" SEQ Figure \* ARABIC ">
-        <w:r>
-          <w:rPr>
-            <w:noProof/>
-          </w:rPr>
-          <w:t>2</w:t>
-        </w:r>
-      </w:fldSimple>
+      <w:r>
+        <w:fldChar w:fldCharType="begin"/>
+      </w:r>
+      <w:r>
+        <w:instrText xml:space="preserve"> SEQ Figure \* ARABIC </w:instrText>
+      </w:r>
+      <w:r>
+        <w:fldChar w:fldCharType="separate"/>
+      </w:r>
+      <w:r>
+        <w:rPr>
+          <w:noProof/>
+        </w:rPr>
+        <w:t>2</w:t>
+      </w:r>
+      <w:r>
+        <w:fldChar w:fldCharType="end"/>
+      </w:r>
       <w:r>
         <w:t xml:space="preserve"> – The main window with PowerON.TapPlan loaded</w:t>
       </w:r>
@@ -1733,7 +1808,16 @@
               <w:t>Failed</w:t>
             </w:r>
             <w:r>
-              <w:t xml:space="preserve"> (failed steps) and </w:t>
+              <w:t xml:space="preserve"> (failed steps), </w:t>
+            </w:r>
+            <w:r>
+              <w:rPr>
+                <w:b/>
+              </w:rPr>
+              <w:t>View Results</w:t>
+            </w:r>
+            <w:r>
+              <w:t xml:space="preserve"> (the results database in the test results viewer) and </w:t>
             </w:r>
             <w:r>
               <w:rPr>
@@ -2013,7 +2097,7 @@
       <w:pPr>
         <w:pStyle w:val="Heading1"/>
       </w:pPr>
-      <w:bookmarkStart w:id="3" w:name="_Toc242691811"/>
+      <w:bookmarkStart w:id="3" w:name="_Toc244079244"/>
       <w:r>
         <w:t>4. Tutorial: run PowerON.TapPlan</w:t>
       </w:r>
@@ -2081,7 +2165,7 @@
         <w:pStyle w:val="ListNumber"/>
         <w:numPr>
           <w:ilvl w:val="0"/>
-          <w:numId w:val="6"/>
+          <w:numId w:val="11"/>
         </w:numPr>
       </w:pPr>
       <w:r>
@@ -2157,7 +2241,7 @@
         <w:rPr>
           <w:color w:val="404040"/>
         </w:rPr>
-        <w:t xml:space="preserve">Values you type here apply to this run only. To change what a parameter starts at every time, change it under Settings › Default parameter values (section 7). </w:t>
+        <w:t xml:space="preserve">Values you type here apply to this run only. To change what a parameter starts at every time, change it on the Parameters tab in Settings (section 7). </w:t>
       </w:r>
       <w:r>
         <w:rPr>
@@ -2252,16 +2336,10 @@
           <w:noProof/>
         </w:rPr>
         <w:drawing>
-          <wp:inline distT="0" distB="0" distL="0" distR="0" wp14:anchorId="6BBE733A" wp14:editId="04576A0A">
-            <wp:extent cx="5486400" cy="4949527"/>
+          <wp:inline distT="0" distB="0" distL="0" distR="0" wp14:anchorId="349672D5" wp14:editId="0AC013A6">
+            <wp:extent cx="5486400" cy="4945984"/>
             <wp:effectExtent l="0" t="0" r="0" b="0"/>
-            <wp:docPr id="3" name="Picture 3">
-              <a:extLst xmlns:a="http://schemas.openxmlformats.org/drawingml/2006/main">
-                <a:ext uri="{FF2B5EF4-FFF2-40B4-BE49-F238E27FC236}">
-                  <a16:creationId xmlns:a16="http://schemas.microsoft.com/office/drawing/2014/main" id="{AA9A449B-63B1-4495-9BC1-E0A5210111AA}"/>
-                </a:ext>
-              </a:extLst>
-            </wp:docPr>
+            <wp:docPr id="3" name="Picture 3"/>
             <wp:cNvGraphicFramePr>
               <a:graphicFrameLocks xmlns:a="http://schemas.openxmlformats.org/drawingml/2006/main" noChangeAspect="1"/>
             </wp:cNvGraphicFramePr>
@@ -2273,7 +2351,7 @@
                     <pic:cNvPicPr/>
                   </pic:nvPicPr>
                   <pic:blipFill>
-                    <a:blip r:embed="rId9"/>
+                    <a:blip r:embed="rId10"/>
                     <a:stretch>
                       <a:fillRect/>
                     </a:stretch>
@@ -2281,7 +2359,7 @@
                   <pic:spPr>
                     <a:xfrm>
                       <a:off x="0" y="0"/>
-                      <a:ext cx="5486400" cy="4949527"/>
+                      <a:ext cx="5486400" cy="4945984"/>
                     </a:xfrm>
                     <a:prstGeom prst="rect">
                       <a:avLst/>
@@ -2302,14 +2380,24 @@
       <w:r>
         <w:t xml:space="preserve">Figure </w:t>
       </w:r>
-      <w:fldSimple w:instr=" SEQ Figure \* ARABIC ">
-        <w:r>
-          <w:rPr>
-            <w:noProof/>
-          </w:rPr>
-          <w:t>3</w:t>
-        </w:r>
-      </w:fldSimple>
+      <w:r>
+        <w:fldChar w:fldCharType="begin"/>
+      </w:r>
+      <w:r>
+        <w:instrText xml:space="preserve"> SEQ Figure \* ARABIC </w:instrText>
+      </w:r>
+      <w:r>
+        <w:fldChar w:fldCharType="separate"/>
+      </w:r>
+      <w:r>
+        <w:rPr>
+          <w:noProof/>
+        </w:rPr>
+        <w:t>3</w:t>
+      </w:r>
+      <w:r>
+        <w:fldChar w:fldCharType="end"/>
+      </w:r>
       <w:r>
         <w:t xml:space="preserve"> – PowerON.TapPlan running – every step so far has passed</w:t>
       </w:r>
@@ -2337,16 +2425,10 @@
           <w:noProof/>
         </w:rPr>
         <w:drawing>
-          <wp:inline distT="0" distB="0" distL="0" distR="0" wp14:anchorId="288BBFC0" wp14:editId="1447F27C">
-            <wp:extent cx="5486400" cy="4949527"/>
+          <wp:inline distT="0" distB="0" distL="0" distR="0" wp14:anchorId="05BE789D" wp14:editId="7725C013">
+            <wp:extent cx="5486400" cy="4945984"/>
             <wp:effectExtent l="0" t="0" r="0" b="0"/>
-            <wp:docPr id="4" name="Picture 4">
-              <a:extLst xmlns:a="http://schemas.openxmlformats.org/drawingml/2006/main">
-                <a:ext uri="{FF2B5EF4-FFF2-40B4-BE49-F238E27FC236}">
-                  <a16:creationId xmlns:a16="http://schemas.microsoft.com/office/drawing/2014/main" id="{77A2FCF5-9520-418E-9716-36FFA9B10191}"/>
-                </a:ext>
-              </a:extLst>
-            </wp:docPr>
+            <wp:docPr id="4" name="Picture 4"/>
             <wp:cNvGraphicFramePr>
               <a:graphicFrameLocks xmlns:a="http://schemas.openxmlformats.org/drawingml/2006/main" noChangeAspect="1"/>
             </wp:cNvGraphicFramePr>
@@ -2358,7 +2440,7 @@
                     <pic:cNvPicPr/>
                   </pic:nvPicPr>
                   <pic:blipFill>
-                    <a:blip r:embed="rId10"/>
+                    <a:blip r:embed="rId11"/>
                     <a:stretch>
                       <a:fillRect/>
                     </a:stretch>
@@ -2366,7 +2448,7 @@
                   <pic:spPr>
                     <a:xfrm>
                       <a:off x="0" y="0"/>
-                      <a:ext cx="5486400" cy="4949527"/>
+                      <a:ext cx="5486400" cy="4945984"/>
                     </a:xfrm>
                     <a:prstGeom prst="rect">
                       <a:avLst/>
@@ -2387,14 +2469,24 @@
       <w:r>
         <w:t xml:space="preserve">Figure </w:t>
       </w:r>
-      <w:fldSimple w:instr=" SEQ Figure \* ARABIC ">
-        <w:r>
-          <w:rPr>
-            <w:noProof/>
-          </w:rPr>
-          <w:t>4</w:t>
-        </w:r>
-      </w:fldSimple>
+      <w:r>
+        <w:fldChar w:fldCharType="begin"/>
+      </w:r>
+      <w:r>
+        <w:instrText xml:space="preserve"> SEQ Figure \* ARABIC </w:instrText>
+      </w:r>
+      <w:r>
+        <w:fldChar w:fldCharType="separate"/>
+      </w:r>
+      <w:r>
+        <w:rPr>
+          <w:noProof/>
+        </w:rPr>
+        <w:t>4</w:t>
+      </w:r>
+      <w:r>
+        <w:fldChar w:fldCharType="end"/>
+      </w:r>
       <w:r>
         <w:t xml:space="preserve"> – A finished run with a Passed verdict</w:t>
       </w:r>
@@ -2431,7 +2523,7 @@
       <w:pPr>
         <w:pStyle w:val="Heading1"/>
       </w:pPr>
-      <w:bookmarkStart w:id="4" w:name="_Toc242691812"/>
+      <w:bookmarkStart w:id="4" w:name="_Toc244079245"/>
       <w:r>
         <w:t>5. When a test fails</w:t>
       </w:r>
@@ -2448,7 +2540,7 @@
         <w:t>Failed</w:t>
       </w:r>
       <w:r>
-        <w:t xml:space="preserve"> light comes on and flashes, and the step history shows which step failed and the results it published. In Figure 5, PowerON.TapPlan's "Check if DUT Alive" step failed, so the run finished Failed.</w:t>
+        <w:t xml:space="preserve"> light comes on and flashes, and the step history shows which step failed and the results it published. In Figure 5, three PowerON.TapPlan measurements failed – a VREFB reading, the code version check and the QCA voltage – so the run finished Failed.</w:t>
       </w:r>
     </w:p>
     <w:p>
@@ -2461,16 +2553,10 @@
           <w:noProof/>
         </w:rPr>
         <w:drawing>
-          <wp:inline distT="0" distB="0" distL="0" distR="0" wp14:anchorId="272E2856" wp14:editId="30CE21F1">
-            <wp:extent cx="5486400" cy="4949527"/>
+          <wp:inline distT="0" distB="0" distL="0" distR="0" wp14:anchorId="7E469D13" wp14:editId="7604CBA0">
+            <wp:extent cx="5486400" cy="4945984"/>
             <wp:effectExtent l="0" t="0" r="0" b="0"/>
-            <wp:docPr id="5" name="Picture 5">
-              <a:extLst xmlns:a="http://schemas.openxmlformats.org/drawingml/2006/main">
-                <a:ext uri="{FF2B5EF4-FFF2-40B4-BE49-F238E27FC236}">
-                  <a16:creationId xmlns:a16="http://schemas.microsoft.com/office/drawing/2014/main" id="{28847B4C-6219-43D6-AE4E-AEC3FED2C48B}"/>
-                </a:ext>
-              </a:extLst>
-            </wp:docPr>
+            <wp:docPr id="5" name="Picture 5"/>
             <wp:cNvGraphicFramePr>
               <a:graphicFrameLocks xmlns:a="http://schemas.openxmlformats.org/drawingml/2006/main" noChangeAspect="1"/>
             </wp:cNvGraphicFramePr>
@@ -2482,7 +2568,7 @@
                     <pic:cNvPicPr/>
                   </pic:nvPicPr>
                   <pic:blipFill>
-                    <a:blip r:embed="rId11"/>
+                    <a:blip r:embed="rId12"/>
                     <a:stretch>
                       <a:fillRect/>
                     </a:stretch>
@@ -2490,7 +2576,7 @@
                   <pic:spPr>
                     <a:xfrm>
                       <a:off x="0" y="0"/>
-                      <a:ext cx="5486400" cy="4949527"/>
+                      <a:ext cx="5486400" cy="4945984"/>
                     </a:xfrm>
                     <a:prstGeom prst="rect">
                       <a:avLst/>
@@ -2511,16 +2597,26 @@
       <w:r>
         <w:t xml:space="preserve">Figure </w:t>
       </w:r>
-      <w:fldSimple w:instr=" SEQ Figure \* ARABIC ">
-        <w:r>
-          <w:rPr>
-            <w:noProof/>
-          </w:rPr>
-          <w:t>5</w:t>
-        </w:r>
-      </w:fldSimple>
-      <w:r>
-        <w:t xml:space="preserve"> – A run that failed at "Check if DUT Alive"</w:t>
+      <w:r>
+        <w:fldChar w:fldCharType="begin"/>
+      </w:r>
+      <w:r>
+        <w:instrText xml:space="preserve"> SEQ Figure \* ARABIC </w:instrText>
+      </w:r>
+      <w:r>
+        <w:fldChar w:fldCharType="separate"/>
+      </w:r>
+      <w:r>
+        <w:rPr>
+          <w:noProof/>
+        </w:rPr>
+        <w:t>5</w:t>
+      </w:r>
+      <w:r>
+        <w:fldChar w:fldCharType="end"/>
+      </w:r>
+      <w:r>
+        <w:t xml:space="preserve"> – A PowerON.TapPlan run with three failed measurements</w:t>
       </w:r>
     </w:p>
     <w:p>
@@ -2534,7 +2630,16 @@
         <w:t>Failed</w:t>
       </w:r>
       <w:r>
-        <w:t xml:space="preserve"> to see just the failed steps, with more detail than the step history (Figure 6). Each run's failures are headed with the plan name and the time the run started. Click </w:t>
+        <w:t xml:space="preserve"> to see just the failed steps, with more detail than the step history (Figure 6). Each run's failures are headed with the plan name and the time the run started, and each failed measurement shows its </w:t>
+      </w:r>
+      <w:r>
+        <w:rPr>
+          <w:b/>
+        </w:rPr>
+        <w:t>Limits</w:t>
+      </w:r>
+      <w:r>
+        <w:t xml:space="preserve"> above the value it measured. Click </w:t>
       </w:r>
       <w:r>
         <w:rPr>
@@ -2556,16 +2661,10 @@
           <w:noProof/>
         </w:rPr>
         <w:drawing>
-          <wp:inline distT="0" distB="0" distL="0" distR="0" wp14:anchorId="6EF8E4F4" wp14:editId="5D744CA4">
-            <wp:extent cx="5120640" cy="3767419"/>
+          <wp:inline distT="0" distB="0" distL="0" distR="0" wp14:anchorId="31049E5B" wp14:editId="193BCBD3">
+            <wp:extent cx="5120640" cy="3765624"/>
             <wp:effectExtent l="0" t="0" r="0" b="0"/>
-            <wp:docPr id="6" name="Picture 6">
-              <a:extLst xmlns:a="http://schemas.openxmlformats.org/drawingml/2006/main">
-                <a:ext uri="{FF2B5EF4-FFF2-40B4-BE49-F238E27FC236}">
-                  <a16:creationId xmlns:a16="http://schemas.microsoft.com/office/drawing/2014/main" id="{44B1487D-D44E-428B-9241-777536070B12}"/>
-                </a:ext>
-              </a:extLst>
-            </wp:docPr>
+            <wp:docPr id="6" name="Picture 6"/>
             <wp:cNvGraphicFramePr>
               <a:graphicFrameLocks xmlns:a="http://schemas.openxmlformats.org/drawingml/2006/main" noChangeAspect="1"/>
             </wp:cNvGraphicFramePr>
@@ -2577,7 +2676,7 @@
                     <pic:cNvPicPr/>
                   </pic:nvPicPr>
                   <pic:blipFill>
-                    <a:blip r:embed="rId12"/>
+                    <a:blip r:embed="rId13"/>
                     <a:stretch>
                       <a:fillRect/>
                     </a:stretch>
@@ -2585,7 +2684,7 @@
                   <pic:spPr>
                     <a:xfrm>
                       <a:off x="0" y="0"/>
-                      <a:ext cx="5120640" cy="3767419"/>
+                      <a:ext cx="5120640" cy="3765624"/>
                     </a:xfrm>
                     <a:prstGeom prst="rect">
                       <a:avLst/>
@@ -2606,16 +2705,132 @@
       <w:r>
         <w:t xml:space="preserve">Figure </w:t>
       </w:r>
-      <w:fldSimple w:instr=" SEQ Figure \* ARABIC ">
-        <w:r>
-          <w:rPr>
-            <w:noProof/>
-          </w:rPr>
-          <w:t>6</w:t>
-        </w:r>
-      </w:fldSimple>
-      <w:r>
-        <w:t xml:space="preserve"> – The Failed / Error Steps window</w:t>
+      <w:r>
+        <w:fldChar w:fldCharType="begin"/>
+      </w:r>
+      <w:r>
+        <w:instrText xml:space="preserve"> SEQ Figure \* ARABIC </w:instrText>
+      </w:r>
+      <w:r>
+        <w:fldChar w:fldCharType="separate"/>
+      </w:r>
+      <w:r>
+        <w:rPr>
+          <w:noProof/>
+        </w:rPr>
+        <w:t>6</w:t>
+      </w:r>
+      <w:r>
+        <w:fldChar w:fldCharType="end"/>
+      </w:r>
+      <w:r>
+        <w:t xml:space="preserve"> – The Failed / Error Steps window, with each step's limits</w:t>
+      </w:r>
+    </w:p>
+    <w:p>
+      <w:pPr>
+        <w:pStyle w:val="Heading2"/>
+      </w:pPr>
+      <w:r>
+        <w:t>Reading the limits</w:t>
+      </w:r>
+    </w:p>
+    <w:p>
+      <w:r>
+        <w:t>The Limits line shows the minimum and maximum set on that step in the test plan – the same values as the step's Limits settings in the OpenTAP Editor. Compare them with the value below to see how far out the unit was. In Figure 6:</w:t>
+      </w:r>
+    </w:p>
+    <w:p>
+      <w:pPr>
+        <w:pStyle w:val="ListBullet"/>
+      </w:pPr>
+      <w:r>
+        <w:rPr>
+          <w:b/>
+        </w:rPr>
+        <w:t>LabjackRead VREFB (2)</w:t>
+      </w:r>
+      <w:r>
+        <w:t xml:space="preserve"> – Limits: Min=4.5, Max=5.5, but read 0.0353737: close to zero, far outside the range rather than just slightly off.</w:t>
+      </w:r>
+    </w:p>
+    <w:p>
+      <w:pPr>
+        <w:pStyle w:val="ListBullet"/>
+      </w:pPr>
+      <w:r>
+        <w:rPr>
+          <w:b/>
+        </w:rPr>
+        <w:t>Read mpl_prg_ver_minor</w:t>
+      </w:r>
+      <w:r>
+        <w:t xml:space="preserve"> – Limits: Min=8, Max=8, so the plan expects exactly 8, but the unit reported 9.</w:t>
+      </w:r>
+    </w:p>
+    <w:p>
+      <w:pPr>
+        <w:pStyle w:val="ListBullet"/>
+      </w:pPr>
+      <w:r>
+        <w:rPr>
+          <w:b/>
+        </w:rPr>
+        <w:t>Read QCA Voltage ON</w:t>
+      </w:r>
+      <w:r>
+        <w:t xml:space="preserve"> – Limits: Min=3.2, Max=3.4, but read 1.99707: well below the range.</w:t>
+      </w:r>
+    </w:p>
+    <w:p>
+      <w:r>
+        <w:t xml:space="preserve">Some entries have no Limits line. </w:t>
+      </w:r>
+      <w:r>
+        <w:rPr>
+          <w:b/>
+        </w:rPr>
+        <w:t>Check VREFs</w:t>
+      </w:r>
+      <w:r>
+        <w:t xml:space="preserve"> and </w:t>
+      </w:r>
+      <w:r>
+        <w:rPr>
+          <w:b/>
+        </w:rPr>
+        <w:t>CheckDUTCodeRevision</w:t>
+      </w:r>
+      <w:r>
+        <w:t xml:space="preserve"> are groups of steps: they fail because a step inside them failed, and have no limits of their own – look at the entry just above them. If a step's limit check is turned off in the plan, its limits are shown with "(limit check off)" after them.</w:t>
+      </w:r>
+    </w:p>
+    <w:p>
+      <w:pPr>
+        <w:pBdr>
+          <w:left w:val="single" w:sz="18" w:space="8" w:color="1F4E79"/>
+        </w:pBdr>
+        <w:ind w:left="360"/>
+      </w:pPr>
+      <w:r>
+        <w:rPr>
+          <w:color w:val="404040"/>
+        </w:rPr>
+        <w:t>Limits need the TapRunner Status plugin from TapRunner 1.3.5 or later in OpenTAP (section 2). With an older plugin, the failure log has the measured values but no Limits lines.</w:t>
+      </w:r>
+    </w:p>
+    <w:p>
+      <w:r>
+        <w:t xml:space="preserve">Click </w:t>
+      </w:r>
+      <w:r>
+        <w:rPr>
+          <w:b/>
+        </w:rPr>
+        <w:t>Save As…</w:t>
+      </w:r>
+      <w:r>
+        <w:t xml:space="preserve"> to save a copy of the whole failure log to a file you choose, for example to attach to a defect report or send to an engineer.</w:t>
       </w:r>
     </w:p>
     <w:p>
@@ -3033,7 +3248,7 @@
       <w:pPr>
         <w:pStyle w:val="Heading1"/>
       </w:pPr>
-      <w:bookmarkStart w:id="5" w:name="_Toc242691813"/>
+      <w:bookmarkStart w:id="5" w:name="_Toc244079246"/>
       <w:r>
         <w:t>6. Stopping a run</w:t>
       </w:r>
@@ -3221,7 +3436,7 @@
       <w:pPr>
         <w:pStyle w:val="Heading1"/>
       </w:pPr>
-      <w:bookmarkStart w:id="6" w:name="_Toc242691814"/>
+      <w:bookmarkStart w:id="6" w:name="_Toc244079247"/>
       <w:r>
         <w:t>7. Setting up parameters for the station</w:t>
       </w:r>
@@ -3237,16 +3452,16 @@
     </w:p>
     <w:p>
       <w:r>
-        <w:t xml:space="preserve">Settings › General › </w:t>
+        <w:t xml:space="preserve">The </w:t>
       </w:r>
       <w:r>
         <w:rPr>
           <w:b/>
         </w:rPr>
-        <w:t>Default parameter values</w:t>
-      </w:r>
-      <w:r>
-        <w:t xml:space="preserve"> (Figure 7) holds a value for each parameter name. These are filled in every time a plan with that parameter loads, and again when you click Load Defaults. A value here always wins over the plan's own default; leave it blank to use the plan's. </w:t>
+        <w:t>Parameters</w:t>
+      </w:r>
+      <w:r>
+        <w:t xml:space="preserve"> tab in Settings (Figure 7) holds a default value for each parameter name. These are filled in every time a plan with that parameter loads, and again when you click Load Defaults. A value here always wins over the plan's own default; leave it blank to use the plan's. </w:t>
       </w:r>
       <w:r>
         <w:rPr>
@@ -3299,16 +3514,10 @@
           <w:noProof/>
         </w:rPr>
         <w:drawing>
-          <wp:inline distT="0" distB="0" distL="0" distR="0" wp14:anchorId="51AD0DE9" wp14:editId="76FB97C8">
-            <wp:extent cx="3840480" cy="4279579"/>
+          <wp:inline distT="0" distB="0" distL="0" distR="0" wp14:anchorId="26070B10" wp14:editId="77401B22">
+            <wp:extent cx="3840480" cy="4274758"/>
             <wp:effectExtent l="0" t="0" r="0" b="0"/>
-            <wp:docPr id="7" name="Picture 7">
-              <a:extLst xmlns:a="http://schemas.openxmlformats.org/drawingml/2006/main">
-                <a:ext uri="{FF2B5EF4-FFF2-40B4-BE49-F238E27FC236}">
-                  <a16:creationId xmlns:a16="http://schemas.microsoft.com/office/drawing/2014/main" id="{4BF3B3FE-FFFE-4647-A792-A7ECAD967DEF}"/>
-                </a:ext>
-              </a:extLst>
-            </wp:docPr>
+            <wp:docPr id="7" name="Picture 7"/>
             <wp:cNvGraphicFramePr>
               <a:graphicFrameLocks xmlns:a="http://schemas.openxmlformats.org/drawingml/2006/main" noChangeAspect="1"/>
             </wp:cNvGraphicFramePr>
@@ -3320,7 +3529,7 @@
                     <pic:cNvPicPr/>
                   </pic:nvPicPr>
                   <pic:blipFill>
-                    <a:blip r:embed="rId13"/>
+                    <a:blip r:embed="rId14"/>
                     <a:stretch>
                       <a:fillRect/>
                     </a:stretch>
@@ -3328,7 +3537,7 @@
                   <pic:spPr>
                     <a:xfrm>
                       <a:off x="0" y="0"/>
-                      <a:ext cx="3840480" cy="4279579"/>
+                      <a:ext cx="3840480" cy="4274758"/>
                     </a:xfrm>
                     <a:prstGeom prst="rect">
                       <a:avLst/>
@@ -3349,16 +3558,26 @@
       <w:r>
         <w:t xml:space="preserve">Figure </w:t>
       </w:r>
-      <w:fldSimple w:instr=" SEQ Figure \* ARABIC ">
-        <w:r>
-          <w:rPr>
-            <w:noProof/>
-          </w:rPr>
-          <w:t>7</w:t>
-        </w:r>
-      </w:fldSimple>
-      <w:r>
-        <w:t xml:space="preserve"> – Default parameter values, with the Hidden column</w:t>
+      <w:r>
+        <w:fldChar w:fldCharType="begin"/>
+      </w:r>
+      <w:r>
+        <w:instrText xml:space="preserve"> SEQ Figure \* ARABIC </w:instrText>
+      </w:r>
+      <w:r>
+        <w:fldChar w:fldCharType="separate"/>
+      </w:r>
+      <w:r>
+        <w:rPr>
+          <w:noProof/>
+        </w:rPr>
+        <w:t>7</w:t>
+      </w:r>
+      <w:r>
+        <w:fldChar w:fldCharType="end"/>
+      </w:r>
+      <w:r>
+        <w:t xml:space="preserve"> – Settings, Parameters tab, with the Hidden column</w:t>
       </w:r>
     </w:p>
     <w:p>
@@ -3371,16 +3590,10 @@
           <w:noProof/>
         </w:rPr>
         <w:drawing>
-          <wp:inline distT="0" distB="0" distL="0" distR="0" wp14:anchorId="2CFAC254" wp14:editId="2AFDCEEF">
-            <wp:extent cx="5486400" cy="4949527"/>
+          <wp:inline distT="0" distB="0" distL="0" distR="0" wp14:anchorId="715DDBA3" wp14:editId="38BFF8D2">
+            <wp:extent cx="5486400" cy="4945984"/>
             <wp:effectExtent l="0" t="0" r="0" b="0"/>
-            <wp:docPr id="8" name="Picture 8">
-              <a:extLst xmlns:a="http://schemas.openxmlformats.org/drawingml/2006/main">
-                <a:ext uri="{FF2B5EF4-FFF2-40B4-BE49-F238E27FC236}">
-                  <a16:creationId xmlns:a16="http://schemas.microsoft.com/office/drawing/2014/main" id="{D35F265D-E893-47B7-B9BF-14E4E02C1505}"/>
-                </a:ext>
-              </a:extLst>
-            </wp:docPr>
+            <wp:docPr id="8" name="Picture 8"/>
             <wp:cNvGraphicFramePr>
               <a:graphicFrameLocks xmlns:a="http://schemas.openxmlformats.org/drawingml/2006/main" noChangeAspect="1"/>
             </wp:cNvGraphicFramePr>
@@ -3392,7 +3605,7 @@
                     <pic:cNvPicPr/>
                   </pic:nvPicPr>
                   <pic:blipFill>
-                    <a:blip r:embed="rId14"/>
+                    <a:blip r:embed="rId15"/>
                     <a:stretch>
                       <a:fillRect/>
                     </a:stretch>
@@ -3400,7 +3613,7 @@
                   <pic:spPr>
                     <a:xfrm>
                       <a:off x="0" y="0"/>
-                      <a:ext cx="5486400" cy="4949527"/>
+                      <a:ext cx="5486400" cy="4945984"/>
                     </a:xfrm>
                     <a:prstGeom prst="rect">
                       <a:avLst/>
@@ -3421,14 +3634,24 @@
       <w:r>
         <w:t xml:space="preserve">Figure </w:t>
       </w:r>
-      <w:fldSimple w:instr=" SEQ Figure \* ARABIC ">
-        <w:r>
-          <w:rPr>
-            <w:noProof/>
-          </w:rPr>
-          <w:t>8</w:t>
-        </w:r>
-      </w:fldSimple>
+      <w:r>
+        <w:fldChar w:fldCharType="begin"/>
+      </w:r>
+      <w:r>
+        <w:instrText xml:space="preserve"> SEQ Figure \* ARABIC </w:instrText>
+      </w:r>
+      <w:r>
+        <w:fldChar w:fldCharType="separate"/>
+      </w:r>
+      <w:r>
+        <w:rPr>
+          <w:noProof/>
+        </w:rPr>
+        <w:t>8</w:t>
+      </w:r>
+      <w:r>
+        <w:fldChar w:fldCharType="end"/>
+      </w:r>
       <w:r>
         <w:t xml:space="preserve"> – PowerON.TapPlan with its hidden parameters shown greyed out</w:t>
       </w:r>
@@ -3456,16 +3679,10 @@
           <w:noProof/>
         </w:rPr>
         <w:drawing>
-          <wp:inline distT="0" distB="0" distL="0" distR="0" wp14:anchorId="65F86610" wp14:editId="05705958">
-            <wp:extent cx="3840480" cy="4279579"/>
+          <wp:inline distT="0" distB="0" distL="0" distR="0" wp14:anchorId="37B96CD4" wp14:editId="5F90C101">
+            <wp:extent cx="3840480" cy="4274758"/>
             <wp:effectExtent l="0" t="0" r="0" b="0"/>
-            <wp:docPr id="9" name="Picture 9">
-              <a:extLst xmlns:a="http://schemas.openxmlformats.org/drawingml/2006/main">
-                <a:ext uri="{FF2B5EF4-FFF2-40B4-BE49-F238E27FC236}">
-                  <a16:creationId xmlns:a16="http://schemas.microsoft.com/office/drawing/2014/main" id="{41169A83-6D7C-48C9-ACD3-6392D807DF2F}"/>
-                </a:ext>
-              </a:extLst>
-            </wp:docPr>
+            <wp:docPr id="9" name="Picture 9"/>
             <wp:cNvGraphicFramePr>
               <a:graphicFrameLocks xmlns:a="http://schemas.openxmlformats.org/drawingml/2006/main" noChangeAspect="1"/>
             </wp:cNvGraphicFramePr>
@@ -3477,7 +3694,7 @@
                     <pic:cNvPicPr/>
                   </pic:nvPicPr>
                   <pic:blipFill>
-                    <a:blip r:embed="rId15"/>
+                    <a:blip r:embed="rId16"/>
                     <a:stretch>
                       <a:fillRect/>
                     </a:stretch>
@@ -3485,7 +3702,7 @@
                   <pic:spPr>
                     <a:xfrm>
                       <a:off x="0" y="0"/>
-                      <a:ext cx="3840480" cy="4279579"/>
+                      <a:ext cx="3840480" cy="4274758"/>
                     </a:xfrm>
                     <a:prstGeom prst="rect">
                       <a:avLst/>
@@ -3506,14 +3723,24 @@
       <w:r>
         <w:t xml:space="preserve">Figure </w:t>
       </w:r>
-      <w:fldSimple w:instr=" SEQ Figure \* ARABIC ">
-        <w:r>
-          <w:rPr>
-            <w:noProof/>
-          </w:rPr>
-          <w:t>9</w:t>
-        </w:r>
-      </w:fldSimple>
+      <w:r>
+        <w:fldChar w:fldCharType="begin"/>
+      </w:r>
+      <w:r>
+        <w:instrText xml:space="preserve"> SEQ Figure \* ARABIC </w:instrText>
+      </w:r>
+      <w:r>
+        <w:fldChar w:fldCharType="separate"/>
+      </w:r>
+      <w:r>
+        <w:rPr>
+          <w:noProof/>
+        </w:rPr>
+        <w:t>9</w:t>
+      </w:r>
+      <w:r>
+        <w:fldChar w:fldCharType="end"/>
+      </w:r>
       <w:r>
         <w:t xml:space="preserve"> – Settings, Status Colors tab</w:t>
       </w:r>
@@ -3522,9 +3749,9 @@
       <w:pPr>
         <w:pStyle w:val="Heading1"/>
       </w:pPr>
-      <w:bookmarkStart w:id="7" w:name="_Toc242691815"/>
-      <w:r>
-        <w:t>8. Logs</w:t>
+      <w:bookmarkStart w:id="7" w:name="_Toc244079248"/>
+      <w:r>
+        <w:t>8. Logs and stored results</w:t>
       </w:r>
       <w:bookmarkEnd w:id="7"/>
     </w:p>
@@ -3652,7 +3879,7 @@
               <w:cnfStyle w:val="000000010000" w:firstRow="0" w:lastRow="0" w:firstColumn="0" w:lastColumn="0" w:oddVBand="0" w:evenVBand="0" w:oddHBand="0" w:evenHBand="1" w:firstRowFirstColumn="0" w:firstRowLastColumn="0" w:lastRowFirstColumn="0" w:lastRowLastColumn="0"/>
             </w:pPr>
             <w:r>
-              <w:t>TapRunner's failure log: only the steps that ended Fail or Error, grouped by run.</w:t>
+              <w:t>TapRunner's failure log: only the steps that ended Fail or Error, grouped by run, with each step's limits. Save As… saves a copy.</w:t>
             </w:r>
           </w:p>
         </w:tc>
@@ -3660,6 +3887,46 @@
       <w:tr>
         <w:trPr>
           <w:cnfStyle w:val="000000100000" w:firstRow="0" w:lastRow="0" w:firstColumn="0" w:lastColumn="0" w:oddVBand="0" w:evenVBand="0" w:oddHBand="1" w:evenHBand="0" w:firstRowFirstColumn="0" w:firstRowLastColumn="0" w:lastRowFirstColumn="0" w:lastRowLastColumn="0"/>
+          <w:cantSplit/>
+          <w:jc w:val="center"/>
+        </w:trPr>
+        <w:tc>
+          <w:tcPr>
+            <w:cnfStyle w:val="001000000000" w:firstRow="0" w:lastRow="0" w:firstColumn="1" w:lastColumn="0" w:oddVBand="0" w:evenVBand="0" w:oddHBand="0" w:evenHBand="0" w:firstRowFirstColumn="0" w:firstRowLastColumn="0" w:lastRowFirstColumn="0" w:lastRowLastColumn="0"/>
+            <w:tcW w:w="3024" w:type="dxa"/>
+          </w:tcPr>
+          <w:p>
+            <w:pPr>
+              <w:keepNext/>
+              <w:spacing w:after="40"/>
+            </w:pPr>
+            <w:r>
+              <w:rPr>
+                <w:b w:val="0"/>
+              </w:rPr>
+              <w:t>View Results (main window)</w:t>
+            </w:r>
+          </w:p>
+        </w:tc>
+        <w:tc>
+          <w:tcPr>
+            <w:tcW w:w="6336" w:type="dxa"/>
+          </w:tcPr>
+          <w:p>
+            <w:pPr>
+              <w:keepNext/>
+              <w:spacing w:after="40"/>
+              <w:cnfStyle w:val="000000100000" w:firstRow="0" w:lastRow="0" w:firstColumn="0" w:lastColumn="0" w:oddVBand="0" w:evenVBand="0" w:oddHBand="1" w:evenHBand="0" w:firstRowFirstColumn="0" w:firstRowLastColumn="0" w:lastRowFirstColumn="0" w:lastRowLastColumn="0"/>
+            </w:pPr>
+            <w:r>
+              <w:t>The SQLite results database your results are stored in, opened in the test results viewer (TestRunViewer) set in Settings, for browsing past runs.</w:t>
+            </w:r>
+          </w:p>
+        </w:tc>
+      </w:tr>
+      <w:tr>
+        <w:trPr>
+          <w:cnfStyle w:val="000000010000" w:firstRow="0" w:lastRow="0" w:firstColumn="0" w:lastColumn="0" w:oddVBand="0" w:evenVBand="0" w:oddHBand="0" w:evenHBand="1" w:firstRowFirstColumn="0" w:firstRowLastColumn="0" w:lastRowFirstColumn="0" w:lastRowLastColumn="0"/>
           <w:cantSplit/>
           <w:jc w:val="center"/>
         </w:trPr>
@@ -3687,7 +3954,7 @@
           <w:p>
             <w:pPr>
               <w:spacing w:after="40"/>
-              <w:cnfStyle w:val="000000100000" w:firstRow="0" w:lastRow="0" w:firstColumn="0" w:lastColumn="0" w:oddVBand="0" w:evenVBand="0" w:oddHBand="1" w:evenHBand="0" w:firstRowFirstColumn="0" w:firstRowLastColumn="0" w:lastRowFirstColumn="0" w:lastRowLastColumn="0"/>
+              <w:cnfStyle w:val="000000010000" w:firstRow="0" w:lastRow="0" w:firstColumn="0" w:lastColumn="0" w:oddVBand="0" w:evenVBand="0" w:oddHBand="0" w:evenHBand="1" w:firstRowFirstColumn="0" w:firstRowLastColumn="0" w:lastRowFirstColumn="0" w:lastRowLastColumn="0"/>
             </w:pPr>
             <w:r>
               <w:t>TapRunner's own log: every status message and every finished step, with a timestamp, across all runs.</w:t>
@@ -3715,7 +3982,7 @@
       <w:pPr>
         <w:pStyle w:val="Heading1"/>
       </w:pPr>
-      <w:bookmarkStart w:id="8" w:name="_Toc242691816"/>
+      <w:bookmarkStart w:id="8" w:name="_Toc244079249"/>
       <w:r>
         <w:t>9. Quick troubleshooting</w:t>
       </w:r>
@@ -3730,7 +3997,7 @@
       </w:tblPr>
       <w:tblGrid>
         <w:gridCol w:w="3744"/>
-        <w:gridCol w:w="5616"/>
+        <w:gridCol w:w="5798"/>
       </w:tblGrid>
       <w:tr>
         <w:trPr>
@@ -3885,7 +4152,7 @@
               <w:cnfStyle w:val="000000100000" w:firstRow="0" w:lastRow="0" w:firstColumn="0" w:lastColumn="0" w:oddVBand="0" w:evenVBand="0" w:oddHBand="1" w:evenHBand="0" w:firstRowFirstColumn="0" w:firstRowLastColumn="0" w:lastRowFirstColumn="0" w:lastRowLastColumn="0"/>
             </w:pPr>
             <w:r>
-              <w:t>It may be ticked Hidden under Settings › Default parameter values.</w:t>
+              <w:t>It may be ticked Hidden on the Parameters tab in Settings.</w:t>
             </w:r>
           </w:p>
         </w:tc>
@@ -3943,6 +4210,86 @@
           </w:tcPr>
           <w:p>
             <w:pPr>
+              <w:keepNext/>
+              <w:spacing w:after="40"/>
+            </w:pPr>
+            <w:r>
+              <w:rPr>
+                <w:b w:val="0"/>
+              </w:rPr>
+              <w:t>View Results says the viewer or database was not found</w:t>
+            </w:r>
+          </w:p>
+        </w:tc>
+        <w:tc>
+          <w:tcPr>
+            <w:tcW w:w="5616" w:type="dxa"/>
+          </w:tcPr>
+          <w:p>
+            <w:pPr>
+              <w:keepNext/>
+              <w:spacing w:after="40"/>
+              <w:cnfStyle w:val="000000100000" w:firstRow="0" w:lastRow="0" w:firstColumn="0" w:lastColumn="0" w:oddVBand="0" w:evenVBand="0" w:oddHBand="1" w:evenHBand="0" w:firstRowFirstColumn="0" w:firstRowLastColumn="0" w:lastRowFirstColumn="0" w:lastRowLastColumn="0"/>
+            </w:pPr>
+            <w:r>
+              <w:t>Set Test results viewer under Settings. If the database is new, run a test first – it is created by the first run that stores results.</w:t>
+            </w:r>
+          </w:p>
+        </w:tc>
+      </w:tr>
+      <w:tr>
+        <w:trPr>
+          <w:cnfStyle w:val="000000010000" w:firstRow="0" w:lastRow="0" w:firstColumn="0" w:lastColumn="0" w:oddVBand="0" w:evenVBand="0" w:oddHBand="0" w:evenHBand="1" w:firstRowFirstColumn="0" w:firstRowLastColumn="0" w:lastRowFirstColumn="0" w:lastRowLastColumn="0"/>
+          <w:cantSplit/>
+          <w:jc w:val="center"/>
+        </w:trPr>
+        <w:tc>
+          <w:tcPr>
+            <w:cnfStyle w:val="001000000000" w:firstRow="0" w:lastRow="0" w:firstColumn="1" w:lastColumn="0" w:oddVBand="0" w:evenVBand="0" w:oddHBand="0" w:evenHBand="0" w:firstRowFirstColumn="0" w:firstRowLastColumn="0" w:lastRowFirstColumn="0" w:lastRowLastColumn="0"/>
+            <w:tcW w:w="3744" w:type="dxa"/>
+          </w:tcPr>
+          <w:p>
+            <w:pPr>
+              <w:keepNext/>
+              <w:spacing w:after="40"/>
+            </w:pPr>
+            <w:r>
+              <w:rPr>
+                <w:b w:val="0"/>
+              </w:rPr>
+              <w:t>The failure log has no Limits line for a step</w:t>
+            </w:r>
+          </w:p>
+        </w:tc>
+        <w:tc>
+          <w:tcPr>
+            <w:tcW w:w="5616" w:type="dxa"/>
+          </w:tcPr>
+          <w:p>
+            <w:pPr>
+              <w:keepNext/>
+              <w:spacing w:after="40"/>
+              <w:cnfStyle w:val="000000010000" w:firstRow="0" w:lastRow="0" w:firstColumn="0" w:lastColumn="0" w:oddVBand="0" w:evenVBand="0" w:oddHBand="0" w:evenHBand="1" w:firstRowFirstColumn="0" w:firstRowLastColumn="0" w:lastRowFirstColumn="0" w:lastRowLastColumn="0"/>
+            </w:pPr>
+            <w:r>
+              <w:t>If it's a group step (like Check VREFs), that's normal – see section 5. Otherwise the TapRunner Status plugin in OpenTAP is probably older than 1.3.5: check its Version in C:\OpenTAP\Packages\TapRunner.StatusListener\package.xml and run TapRunnerSetup.msi again. To install the plugin by hand, run tap package install from the C:\OpenTAP folder – from any other folder it can fail.</w:t>
+            </w:r>
+          </w:p>
+        </w:tc>
+      </w:tr>
+      <w:tr>
+        <w:trPr>
+          <w:cnfStyle w:val="000000100000" w:firstRow="0" w:lastRow="0" w:firstColumn="0" w:lastColumn="0" w:oddVBand="0" w:evenVBand="0" w:oddHBand="1" w:evenHBand="0" w:firstRowFirstColumn="0" w:firstRowLastColumn="0" w:lastRowFirstColumn="0" w:lastRowLastColumn="0"/>
+          <w:cantSplit/>
+          <w:jc w:val="center"/>
+        </w:trPr>
+        <w:tc>
+          <w:tcPr>
+            <w:cnfStyle w:val="001000000000" w:firstRow="0" w:lastRow="0" w:firstColumn="1" w:lastColumn="0" w:oddVBand="0" w:evenVBand="0" w:oddHBand="0" w:evenHBand="0" w:firstRowFirstColumn="0" w:firstRowLastColumn="0" w:lastRowFirstColumn="0" w:lastRowLastColumn="0"/>
+            <w:tcW w:w="3744" w:type="dxa"/>
+          </w:tcPr>
+          <w:p>
+            <w:pPr>
               <w:spacing w:after="40"/>
             </w:pPr>
             <w:r>
@@ -3971,12 +4318,12 @@
     </w:tbl>
     <w:p/>
     <w:sectPr>
-      <w:headerReference w:type="even" r:id="rId16"/>
-      <w:headerReference w:type="default" r:id="rId17"/>
-      <w:footerReference w:type="even" r:id="rId18"/>
-      <w:footerReference w:type="default" r:id="rId19"/>
-      <w:headerReference w:type="first" r:id="rId20"/>
-      <w:footerReference w:type="first" r:id="rId21"/>
+      <w:headerReference w:type="even" r:id="rId17"/>
+      <w:headerReference w:type="default" r:id="rId18"/>
+      <w:footerReference w:type="even" r:id="rId19"/>
+      <w:footerReference w:type="default" r:id="rId20"/>
+      <w:headerReference w:type="first" r:id="rId21"/>
+      <w:footerReference w:type="first" r:id="rId22"/>
       <w:pgSz w:w="12240" w:h="15840"/>
       <w:pgMar w:top="1440" w:right="1440" w:bottom="1440" w:left="1440" w:header="720" w:footer="720" w:gutter="0"/>
       <w:cols w:space="720"/>
@@ -4033,7 +4380,7 @@
         <w:color w:val="606060"/>
         <w:sz w:val="18"/>
       </w:rPr>
-      <w:t xml:space="preserve">TapRunner 1.3.3 Tutorial  ·  Page </w:t>
+      <w:t xml:space="preserve">TapRunner 1.3.5 Tutorial  ·  Page </w:t>
     </w:r>
     <w:r>
       <w:rPr>
@@ -4276,7 +4623,7 @@
   <w:abstractNum w:abstractNumId="7" w15:restartNumberingAfterBreak="0">
     <w:nsid w:val="FFFFFF88"/>
     <w:multiLevelType w:val="singleLevel"/>
-    <w:tmpl w:val="AA0ABFA0"/>
+    <w:tmpl w:val="D0A62B40"/>
     <w:lvl w:ilvl="0">
       <w:start w:val="1"/>
       <w:numFmt w:val="decimal"/>
@@ -4294,7 +4641,7 @@
   <w:abstractNum w:abstractNumId="8" w15:restartNumberingAfterBreak="0">
     <w:nsid w:val="FFFFFF89"/>
     <w:multiLevelType w:val="singleLevel"/>
-    <w:tmpl w:val="5CD48354"/>
+    <w:tmpl w:val="29761A62"/>
     <w:lvl w:ilvl="0">
       <w:start w:val="1"/>
       <w:numFmt w:val="bullet"/>
@@ -4312,47 +4659,44 @@
       </w:rPr>
     </w:lvl>
   </w:abstractNum>
-  <w:num w:numId="1" w16cid:durableId="1441996679">
+  <w:num w:numId="1" w16cid:durableId="1342855457">
+    <w:abstractNumId w:val="8"/>
+  </w:num>
+  <w:num w:numId="2" w16cid:durableId="2051342464">
+    <w:abstractNumId w:val="6"/>
+  </w:num>
+  <w:num w:numId="3" w16cid:durableId="699404165">
+    <w:abstractNumId w:val="5"/>
+  </w:num>
+  <w:num w:numId="4" w16cid:durableId="1046218604">
+    <w:abstractNumId w:val="4"/>
+  </w:num>
+  <w:num w:numId="5" w16cid:durableId="1928807715">
+    <w:abstractNumId w:val="7"/>
+  </w:num>
+  <w:num w:numId="6" w16cid:durableId="1220626473">
+    <w:abstractNumId w:val="3"/>
+  </w:num>
+  <w:num w:numId="7" w16cid:durableId="1194802020">
+    <w:abstractNumId w:val="2"/>
+  </w:num>
+  <w:num w:numId="8" w16cid:durableId="562526855">
+    <w:abstractNumId w:val="1"/>
+  </w:num>
+  <w:num w:numId="9" w16cid:durableId="1423530567">
+    <w:abstractNumId w:val="0"/>
+  </w:num>
+  <w:num w:numId="10" w16cid:durableId="236205582">
     <w:abstractNumId w:val="7"/>
     <w:lvlOverride w:ilvl="0">
       <w:startOverride w:val="1"/>
     </w:lvlOverride>
   </w:num>
-  <w:num w:numId="2" w16cid:durableId="1915432415">
-    <w:abstractNumId w:val="1"/>
-  </w:num>
-  <w:num w:numId="3" w16cid:durableId="514223387">
-    <w:abstractNumId w:val="6"/>
-  </w:num>
-  <w:num w:numId="4" w16cid:durableId="515777086">
-    <w:abstractNumId w:val="2"/>
-  </w:num>
-  <w:num w:numId="5" w16cid:durableId="525682743">
-    <w:abstractNumId w:val="4"/>
-  </w:num>
-  <w:num w:numId="6" w16cid:durableId="567226880">
+  <w:num w:numId="11" w16cid:durableId="2003921597">
     <w:abstractNumId w:val="7"/>
     <w:lvlOverride w:ilvl="0">
       <w:startOverride w:val="1"/>
     </w:lvlOverride>
-  </w:num>
-  <w:num w:numId="7" w16cid:durableId="625283513">
-    <w:abstractNumId w:val="8"/>
-  </w:num>
-  <w:num w:numId="8" w16cid:durableId="689796641">
-    <w:abstractNumId w:val="0"/>
-  </w:num>
-  <w:num w:numId="9" w16cid:durableId="735857577">
-    <w:abstractNumId w:val="7"/>
-  </w:num>
-  <w:num w:numId="10" w16cid:durableId="73625488">
-    <w:abstractNumId w:val="5"/>
-  </w:num>
-  <w:num w:numId="11" w16cid:durableId="95054296">
-    <w:abstractNumId w:val="3"/>
-  </w:num>
-  <w:num w:numId="12" w16cid:durableId="977107092">
-    <w:abstractNumId w:val="7"/>
   </w:num>
 </w:numbering>
 </file>
@@ -5272,13 +5616,26 @@
     <w:rsid w:val="00326F90"/>
     <w:pPr>
       <w:numPr>
-        <w:numId w:val="7"/>
+        <w:numId w:val="1"/>
       </w:numPr>
       <w:contextualSpacing/>
     </w:pPr>
   </w:style>
   <w:style w:type="paragraph" w:styleId="ListBullet2">
     <w:name w:val="List Bullet 2"/>
+    <w:basedOn w:val="Normal"/>
+    <w:uiPriority w:val="99"/>
+    <w:unhideWhenUsed/>
+    <w:rsid w:val="00326F90"/>
+    <w:pPr>
+      <w:numPr>
+        <w:numId w:val="2"/>
+      </w:numPr>
+      <w:contextualSpacing/>
+    </w:pPr>
+  </w:style>
+  <w:style w:type="paragraph" w:styleId="ListBullet3">
+    <w:name w:val="List Bullet 3"/>
     <w:basedOn w:val="Normal"/>
     <w:uiPriority w:val="99"/>
     <w:unhideWhenUsed/>
@@ -5290,19 +5647,6 @@
       <w:contextualSpacing/>
     </w:pPr>
   </w:style>
-  <w:style w:type="paragraph" w:styleId="ListBullet3">
-    <w:name w:val="List Bullet 3"/>
-    <w:basedOn w:val="Normal"/>
-    <w:uiPriority w:val="99"/>
-    <w:unhideWhenUsed/>
-    <w:rsid w:val="00326F90"/>
-    <w:pPr>
-      <w:numPr>
-        <w:numId w:val="10"/>
-      </w:numPr>
-      <w:contextualSpacing/>
-    </w:pPr>
-  </w:style>
   <w:style w:type="paragraph" w:styleId="ListNumber">
     <w:name w:val="List Number"/>
     <w:basedOn w:val="Normal"/>
@@ -5311,7 +5655,7 @@
     <w:rsid w:val="00326F90"/>
     <w:pPr>
       <w:numPr>
-        <w:numId w:val="12"/>
+        <w:numId w:val="5"/>
       </w:numPr>
       <w:contextualSpacing/>
     </w:pPr>
@@ -5324,7 +5668,7 @@
     <w:rsid w:val="0029639D"/>
     <w:pPr>
       <w:numPr>
-        <w:numId w:val="11"/>
+        <w:numId w:val="6"/>
       </w:numPr>
       <w:contextualSpacing/>
     </w:pPr>
@@ -5337,7 +5681,7 @@
     <w:rsid w:val="0029639D"/>
     <w:pPr>
       <w:numPr>
-        <w:numId w:val="4"/>
+        <w:numId w:val="7"/>
       </w:numPr>
       <w:contextualSpacing/>
     </w:pPr>
@@ -15742,7 +16086,7 @@
     <w:autoRedefine/>
     <w:uiPriority w:val="39"/>
     <w:unhideWhenUsed/>
-    <w:rsid w:val="00650476"/>
+    <w:rsid w:val="00A77785"/>
     <w:pPr>
       <w:spacing w:after="100"/>
     </w:pPr>
@@ -15752,7 +16096,7 @@
     <w:basedOn w:val="DefaultParagraphFont"/>
     <w:uiPriority w:val="99"/>
     <w:unhideWhenUsed/>
-    <w:rsid w:val="00650476"/>
+    <w:rsid w:val="00A77785"/>
     <w:rPr>
       <w:color w:val="0000FF" w:themeColor="hyperlink"/>
       <w:u w:val="single"/>
@@ -16079,4 +16423,16 @@
   </a:objectDefaults>
   <a:extraClrSchemeLst/>
 </a:theme>
+</file>
+
+<file path=customXml/item1.xml><?xml version="1.0" encoding="utf-8"?>
+<b:Sources xmlns:b="http://schemas.openxmlformats.org/officeDocument/2006/bibliography" xmlns="http://schemas.openxmlformats.org/officeDocument/2006/bibliography" SelectedStyle="/APA.XSL" StyleName="APA"/>
+</file>
+
+<file path=customXml/itemProps1.xml><?xml version="1.0" encoding="utf-8"?>
+<ds:datastoreItem xmlns:ds="http://schemas.openxmlformats.org/officeDocument/2006/customXml" ds:itemID="{EF278816-EC6F-A645-907D-7F25AECB1D4A}">
+  <ds:schemaRefs>
+    <ds:schemaRef ds:uri="http://schemas.openxmlformats.org/officeDocument/2006/bibliography"/>
+  </ds:schemaRefs>
+</ds:datastoreItem>
 </file>
</xml_diff>